<commit_message>
seats_shown event now logs booked_seats only (smaller payload); RPC response unchanged
</commit_message>
<xml_diff>
--- a/Flight_Booking_Live_UI_Deliverables.docx
+++ b/Flight_Booking_Live_UI_Deliverables.docx
@@ -1534,16 +1534,16 @@
           <w:szCs w:val="19"/>
         </w:rPr>
         <w:br/>
-        <w:t xml:space="preserve">seats_shown    -&gt; { flight_number, seats:[ ...ALL 180 seats... {seat_number,row_number,</w:t>
-      </w:r>
-      <w:r>
-        <w:rPr>
-          <w:rFonts w:ascii="Consolas" w:cs="Consolas" w:eastAsia="Consolas" w:hAnsi="Consolas"/>
-          <w:sz w:val="19"/>
-          <w:szCs w:val="19"/>
-        </w:rPr>
-        <w:br/>
-        <w:t xml:space="preserve">                    column_letter,seat_type,status,base_price_delta} ] }</w:t>
+        <w:t xml:space="preserve">seats_shown    -&gt; { flight_number, booked_seats:[ "23C", ... ] }   (only booked/blocked</w:t>
+      </w:r>
+      <w:r>
+        <w:rPr>
+          <w:rFonts w:ascii="Consolas" w:cs="Consolas" w:eastAsia="Consolas" w:hAnsi="Consolas"/>
+          <w:sz w:val="19"/>
+          <w:szCs w:val="19"/>
+        </w:rPr>
+        <w:br/>
+        <w:t xml:space="preserve">                    seats; the screen already knows the layout + prices)</w:t>
       </w:r>
       <w:r>
         <w:rPr>

</xml_diff>